<commit_message>
Update model diagram, add image, update gitignore
Replace and expand Models.drawio with a more detailed diagram (added grouped cells for multiple model variants, geometry and layout updates). Add exported models.png. Add '*.dtmp' to .gitignore to ignore draw.io temp files. Update rapor.docx and remove the temporary ~$rapor.docx file.
</commit_message>
<xml_diff>
--- a/rapor.docx
+++ b/rapor.docx
@@ -124,7 +124,16 @@
         </w:tabs>
       </w:pPr>
       <w:r>
-        <w:t>Tam bağlı katman boyutu (fc1_size)</w:t>
+        <w:t>Tam bağlı katman boyutu (fc</w:t>
+      </w:r>
+      <w:r>
+        <w:t xml:space="preserve"> </w:t>
+      </w:r>
+      <w:r>
+        <w:t>unit</w:t>
+      </w:r>
+      <w:r>
+        <w:t>)</w:t>
       </w:r>
     </w:p>
     <w:p>
@@ -299,7 +308,14 @@
                 <w:b/>
                 <w:bCs/>
               </w:rPr>
-              <w:t>FC1 Size</w:t>
+              <w:t xml:space="preserve">FC </w:t>
+            </w:r>
+            <w:r>
+              <w:rPr>
+                <w:b/>
+                <w:bCs/>
+              </w:rPr>
+              <w:t>Unit</w:t>
             </w:r>
           </w:p>
         </w:tc>
@@ -1172,6 +1188,78 @@
         <w:t>bağlı katman boyutunun artırılması model kapasitesini yükseltirken, dropout oranının artırılması düzenlileştirme (regularization) etkisi oluşturmaktadır. Bu farklılıklar sayesinde modeller arasında kapasite–genelleme dengesi bakımından anlamlı performans farklılıkları oluşması beklenmektedir.</w:t>
       </w:r>
     </w:p>
+    <w:p/>
+    <w:p>
+      <w:r>
+        <w:rPr>
+          <w:noProof/>
+        </w:rPr>
+        <w:drawing>
+          <wp:inline distT="0" distB="0" distL="0" distR="0" wp14:anchorId="64636C8A" wp14:editId="5B3C4F61">
+            <wp:extent cx="5724525" cy="2990850"/>
+            <wp:effectExtent l="0" t="0" r="9525" b="0"/>
+            <wp:docPr id="937776211" name="Picture 3"/>
+            <wp:cNvGraphicFramePr>
+              <a:graphicFrameLocks xmlns:a="http://schemas.openxmlformats.org/drawingml/2006/main" noChangeAspect="1"/>
+            </wp:cNvGraphicFramePr>
+            <a:graphic xmlns:a="http://schemas.openxmlformats.org/drawingml/2006/main">
+              <a:graphicData uri="http://schemas.openxmlformats.org/drawingml/2006/picture">
+                <pic:pic xmlns:pic="http://schemas.openxmlformats.org/drawingml/2006/picture">
+                  <pic:nvPicPr>
+                    <pic:cNvPr id="0" name="Picture 3"/>
+                    <pic:cNvPicPr>
+                      <a:picLocks noChangeAspect="1" noChangeArrowheads="1"/>
+                    </pic:cNvPicPr>
+                  </pic:nvPicPr>
+                  <pic:blipFill>
+                    <a:blip r:embed="rId5">
+                      <a:extLst>
+                        <a:ext uri="{28A0092B-C50C-407E-A947-70E740481C1C}">
+                          <a14:useLocalDpi xmlns:a14="http://schemas.microsoft.com/office/drawing/2010/main" val="0"/>
+                        </a:ext>
+                      </a:extLst>
+                    </a:blip>
+                    <a:srcRect/>
+                    <a:stretch>
+                      <a:fillRect/>
+                    </a:stretch>
+                  </pic:blipFill>
+                  <pic:spPr bwMode="auto">
+                    <a:xfrm>
+                      <a:off x="0" y="0"/>
+                      <a:ext cx="5724525" cy="2990850"/>
+                    </a:xfrm>
+                    <a:prstGeom prst="rect">
+                      <a:avLst/>
+                    </a:prstGeom>
+                    <a:noFill/>
+                    <a:ln>
+                      <a:noFill/>
+                    </a:ln>
+                  </pic:spPr>
+                </pic:pic>
+              </a:graphicData>
+            </a:graphic>
+          </wp:inline>
+        </w:drawing>
+      </w:r>
+    </w:p>
+    <w:p/>
+    <w:p>
+      <w:r>
+        <w:t>Yukarıdaki şekilde</w:t>
+      </w:r>
+      <w:r>
+        <w:t xml:space="preserve"> çalışmada kullanılan 10 farklı CNN mimarisi gösterilmektedir. Tüm modeller ortak bir temel yapıya sahiptir: iki evrişim katmanı, maksimum havuzlama, global ortalama havuzlama (GAP), tam bağlı katman, dropout ve 10 sınıflı çıkış katmanı.</w:t>
+      </w:r>
+    </w:p>
+    <w:p>
+      <w:r>
+        <w:lastRenderedPageBreak/>
+        <w:t>Modeller arasındaki farklılıklar filtre sayıları, kernel boyutları, havuzlama parametreleri, tam bağlı katman boyutu ve dropout oranı üzerinden oluşturulmuştur. Bu sayede farklı kapasite ve düzenlileştirme seviyelerine sahip ağ yapıları elde edilerek performans sıralamasının eğitim sürecindeki davranışı analiz edilebilir hale getirilmiştir.</w:t>
+      </w:r>
+    </w:p>
+    <w:p/>
     <w:sectPr>
       <w:pgSz w:w="11906" w:h="16838"/>
       <w:pgMar w:top="1440" w:right="1440" w:bottom="1440" w:left="1440" w:header="708" w:footer="708" w:gutter="0"/>

</xml_diff>